<commit_message>
Added dashboard card for forms in homepage, removed rejected and dean approved in db schema. Removed a row for the equipment borrow form.
</commit_message>
<xml_diff>
--- a/frontend/public/LDCU-Forms-CIT-033-Laboratoty Borrowing of Equipment.docx
+++ b/frontend/public/LDCU-Forms-CIT-033-Laboratoty Borrowing of Equipment.docx
@@ -138,8 +138,19 @@
           <w:szCs w:val="18"/>
           <w:u w:val="single"/>
         </w:rPr>
-        <w:t>{faculty_student_name</w:t>
-      </w:r>
+        <w:t>{</w:t>
+      </w:r>
+      <w:proofErr w:type="spellStart"/>
+      <w:r>
+        <w:rPr>
+          <w:rFonts w:ascii="Cambria" w:eastAsia="Cambria" w:hAnsi="Cambria" w:cs="Cambria"/>
+          <w:sz w:val="18"/>
+          <w:szCs w:val="18"/>
+          <w:u w:val="single"/>
+        </w:rPr>
+        <w:t>faculty_student_name</w:t>
+      </w:r>
+      <w:proofErr w:type="spellEnd"/>
       <w:r>
         <w:rPr>
           <w:rFonts w:ascii="Cambria" w:eastAsia="Cambria" w:hAnsi="Cambria" w:cs="Cambria"/>
@@ -157,8 +168,6 @@
         </w:rPr>
         <w:t xml:space="preserve">    </w:t>
       </w:r>
-      <w:bookmarkStart w:id="0" w:name="_GoBack"/>
-      <w:bookmarkEnd w:id="0"/>
       <w:r>
         <w:rPr>
           <w:rFonts w:ascii="Cambria" w:eastAsia="Cambria" w:hAnsi="Cambria" w:cs="Cambria"/>
@@ -182,7 +191,27 @@
           <w:szCs w:val="18"/>
           <w:u w:val="single"/>
         </w:rPr>
-        <w:t>{year_level}</w:t>
+        <w:t>{</w:t>
+      </w:r>
+      <w:proofErr w:type="spellStart"/>
+      <w:r>
+        <w:rPr>
+          <w:rFonts w:ascii="Cambria" w:eastAsia="Cambria" w:hAnsi="Cambria" w:cs="Cambria"/>
+          <w:sz w:val="18"/>
+          <w:szCs w:val="18"/>
+          <w:u w:val="single"/>
+        </w:rPr>
+        <w:t>year_level</w:t>
+      </w:r>
+      <w:proofErr w:type="spellEnd"/>
+      <w:r>
+        <w:rPr>
+          <w:rFonts w:ascii="Cambria" w:eastAsia="Cambria" w:hAnsi="Cambria" w:cs="Cambria"/>
+          <w:sz w:val="18"/>
+          <w:szCs w:val="18"/>
+          <w:u w:val="single"/>
+        </w:rPr>
+        <w:t>}</w:t>
       </w:r>
     </w:p>
     <w:p>
@@ -218,7 +247,27 @@
           <w:szCs w:val="18"/>
           <w:u w:val="single"/>
         </w:rPr>
-        <w:t>{release_time}</w:t>
+        <w:t>{</w:t>
+      </w:r>
+      <w:proofErr w:type="spellStart"/>
+      <w:r>
+        <w:rPr>
+          <w:rFonts w:ascii="Cambria" w:eastAsia="Cambria" w:hAnsi="Cambria" w:cs="Cambria"/>
+          <w:sz w:val="18"/>
+          <w:szCs w:val="18"/>
+          <w:u w:val="single"/>
+        </w:rPr>
+        <w:t>release_time</w:t>
+      </w:r>
+      <w:proofErr w:type="spellEnd"/>
+      <w:r>
+        <w:rPr>
+          <w:rFonts w:ascii="Cambria" w:eastAsia="Cambria" w:hAnsi="Cambria" w:cs="Cambria"/>
+          <w:sz w:val="18"/>
+          <w:szCs w:val="18"/>
+          <w:u w:val="single"/>
+        </w:rPr>
+        <w:t>}</w:t>
       </w:r>
       <w:r>
         <w:rPr>
@@ -236,7 +285,27 @@
           <w:szCs w:val="18"/>
           <w:u w:val="single"/>
         </w:rPr>
-        <w:t>{returned_time}</w:t>
+        <w:t>{</w:t>
+      </w:r>
+      <w:proofErr w:type="spellStart"/>
+      <w:r>
+        <w:rPr>
+          <w:rFonts w:ascii="Cambria" w:eastAsia="Cambria" w:hAnsi="Cambria" w:cs="Cambria"/>
+          <w:sz w:val="18"/>
+          <w:szCs w:val="18"/>
+          <w:u w:val="single"/>
+        </w:rPr>
+        <w:t>returned_time</w:t>
+      </w:r>
+      <w:proofErr w:type="spellEnd"/>
+      <w:r>
+        <w:rPr>
+          <w:rFonts w:ascii="Cambria" w:eastAsia="Cambria" w:hAnsi="Cambria" w:cs="Cambria"/>
+          <w:sz w:val="18"/>
+          <w:szCs w:val="18"/>
+          <w:u w:val="single"/>
+        </w:rPr>
+        <w:t>}</w:t>
       </w:r>
     </w:p>
     <w:p>
@@ -299,7 +368,25 @@
                 <w:sz w:val="18"/>
                 <w:szCs w:val="18"/>
               </w:rPr>
-              <w:t>Unit/Oty.</w:t>
+              <w:t>Unit/</w:t>
+            </w:r>
+            <w:proofErr w:type="spellStart"/>
+            <w:r>
+              <w:rPr>
+                <w:rFonts w:ascii="Cambria" w:eastAsia="Cambria" w:hAnsi="Cambria" w:cs="Cambria"/>
+                <w:sz w:val="18"/>
+                <w:szCs w:val="18"/>
+              </w:rPr>
+              <w:t>Oty</w:t>
+            </w:r>
+            <w:proofErr w:type="spellEnd"/>
+            <w:r>
+              <w:rPr>
+                <w:rFonts w:ascii="Cambria" w:eastAsia="Cambria" w:hAnsi="Cambria" w:cs="Cambria"/>
+                <w:sz w:val="18"/>
+                <w:szCs w:val="18"/>
+              </w:rPr>
+              <w:t>.</w:t>
             </w:r>
           </w:p>
         </w:tc>
@@ -351,7 +438,25 @@
                 <w:sz w:val="18"/>
                 <w:szCs w:val="18"/>
               </w:rPr>
-              <w:t>{unitQty_column}</w:t>
+              <w:t>{</w:t>
+            </w:r>
+            <w:proofErr w:type="spellStart"/>
+            <w:r>
+              <w:rPr>
+                <w:rFonts w:ascii="Cambria" w:eastAsia="Cambria" w:hAnsi="Cambria" w:cs="Cambria"/>
+                <w:sz w:val="18"/>
+                <w:szCs w:val="18"/>
+              </w:rPr>
+              <w:t>unitQty_column</w:t>
+            </w:r>
+            <w:proofErr w:type="spellEnd"/>
+            <w:r>
+              <w:rPr>
+                <w:rFonts w:ascii="Cambria" w:eastAsia="Cambria" w:hAnsi="Cambria" w:cs="Cambria"/>
+                <w:sz w:val="18"/>
+                <w:szCs w:val="18"/>
+              </w:rPr>
+              <w:t>}</w:t>
             </w:r>
           </w:p>
         </w:tc>
@@ -374,43 +479,26 @@
                 <w:sz w:val="18"/>
                 <w:szCs w:val="18"/>
               </w:rPr>
-              <w:t>{equipmentName_column}</w:t>
+              <w:t>{</w:t>
             </w:r>
-          </w:p>
-        </w:tc>
-      </w:tr>
-      <w:tr>
-        <w:trPr>
-          <w:trHeight w:val="288"/>
-        </w:trPr>
-        <w:tc>
-          <w:tcPr>
-            <w:tcW w:w="985" w:type="dxa"/>
-          </w:tcPr>
-          <w:p>
-            <w:pPr>
-              <w:spacing w:after="0" w:line="240" w:lineRule="auto"/>
+            <w:proofErr w:type="spellStart"/>
+            <w:r>
               <w:rPr>
                 <w:rFonts w:ascii="Cambria" w:eastAsia="Cambria" w:hAnsi="Cambria" w:cs="Cambria"/>
                 <w:sz w:val="18"/>
                 <w:szCs w:val="18"/>
               </w:rPr>
-            </w:pPr>
-          </w:p>
-        </w:tc>
-        <w:tc>
-          <w:tcPr>
-            <w:tcW w:w="4672" w:type="dxa"/>
-          </w:tcPr>
-          <w:p>
-            <w:pPr>
-              <w:spacing w:after="0" w:line="240" w:lineRule="auto"/>
+              <w:t>equipmentName_column</w:t>
+            </w:r>
+            <w:proofErr w:type="spellEnd"/>
+            <w:r>
               <w:rPr>
                 <w:rFonts w:ascii="Cambria" w:eastAsia="Cambria" w:hAnsi="Cambria" w:cs="Cambria"/>
                 <w:sz w:val="18"/>
                 <w:szCs w:val="18"/>
               </w:rPr>
-            </w:pPr>
+              <w:t>}</w:t>
+            </w:r>
           </w:p>
         </w:tc>
       </w:tr>
@@ -457,15 +545,7 @@
           <w:sz w:val="18"/>
           <w:szCs w:val="18"/>
         </w:rPr>
-        <w:t>R</w:t>
-      </w:r>
-      <w:r>
-        <w:rPr>
-          <w:rFonts w:ascii="Cambria" w:eastAsia="Cambria" w:hAnsi="Cambria" w:cs="Cambria"/>
-          <w:sz w:val="18"/>
-          <w:szCs w:val="18"/>
-        </w:rPr>
-        <w:t>equested by:</w:t>
+        <w:t>Requested by:</w:t>
       </w:r>
       <w:r>
         <w:rPr>
@@ -510,7 +590,27 @@
           <w:szCs w:val="18"/>
           <w:u w:val="single"/>
         </w:rPr>
-        <w:t>{requested_by }</w:t>
+        <w:t>{</w:t>
+      </w:r>
+      <w:proofErr w:type="spellStart"/>
+      <w:r>
+        <w:rPr>
+          <w:rFonts w:ascii="Cambria" w:eastAsia="Cambria" w:hAnsi="Cambria" w:cs="Cambria"/>
+          <w:sz w:val="18"/>
+          <w:szCs w:val="18"/>
+          <w:u w:val="single"/>
+        </w:rPr>
+        <w:t>requested_by</w:t>
+      </w:r>
+      <w:proofErr w:type="spellEnd"/>
+      <w:r>
+        <w:rPr>
+          <w:rFonts w:ascii="Cambria" w:eastAsia="Cambria" w:hAnsi="Cambria" w:cs="Cambria"/>
+          <w:sz w:val="18"/>
+          <w:szCs w:val="18"/>
+          <w:u w:val="single"/>
+        </w:rPr>
+        <w:t xml:space="preserve"> }</w:t>
       </w:r>
       <w:r>
         <w:rPr>
@@ -543,7 +643,27 @@
           <w:szCs w:val="16"/>
           <w:u w:val="single"/>
         </w:rPr>
-        <w:t>{approved_by}</w:t>
+        <w:t>{</w:t>
+      </w:r>
+      <w:proofErr w:type="spellStart"/>
+      <w:r>
+        <w:rPr>
+          <w:rFonts w:ascii="Cambria" w:eastAsia="Cambria" w:hAnsi="Cambria" w:cs="Cambria"/>
+          <w:sz w:val="16"/>
+          <w:szCs w:val="16"/>
+          <w:u w:val="single"/>
+        </w:rPr>
+        <w:t>approved_by</w:t>
+      </w:r>
+      <w:proofErr w:type="spellEnd"/>
+      <w:r>
+        <w:rPr>
+          <w:rFonts w:ascii="Cambria" w:eastAsia="Cambria" w:hAnsi="Cambria" w:cs="Cambria"/>
+          <w:sz w:val="16"/>
+          <w:szCs w:val="16"/>
+          <w:u w:val="single"/>
+        </w:rPr>
+        <w:t>}</w:t>
       </w:r>
     </w:p>
     <w:p>
@@ -580,6 +700,8 @@
         <w:tab/>
         <w:t xml:space="preserve">                            Dean</w:t>
       </w:r>
+      <w:bookmarkStart w:id="0" w:name="_GoBack"/>
+      <w:bookmarkEnd w:id="0"/>
     </w:p>
     <w:p>
       <w:pPr>
@@ -596,15 +718,7 @@
           <w:sz w:val="18"/>
           <w:szCs w:val="18"/>
         </w:rPr>
-        <w:t>------------------</w:t>
-      </w:r>
-      <w:r>
-        <w:rPr>
-          <w:rFonts w:ascii="Cambria" w:eastAsia="Cambria" w:hAnsi="Cambria" w:cs="Cambria"/>
-          <w:sz w:val="18"/>
-          <w:szCs w:val="18"/>
-        </w:rPr>
-        <w:t>----------------------------------------------------------------------------</w:t>
+        <w:t>----------------------------------------------------------------------------------------------</w:t>
       </w:r>
     </w:p>
     <w:p>
@@ -730,7 +844,27 @@
           <w:szCs w:val="18"/>
           <w:u w:val="single"/>
         </w:rPr>
-        <w:t>{monitored_by}</w:t>
+        <w:t>{</w:t>
+      </w:r>
+      <w:proofErr w:type="spellStart"/>
+      <w:r>
+        <w:rPr>
+          <w:rFonts w:ascii="Cambria" w:eastAsia="Cambria" w:hAnsi="Cambria" w:cs="Cambria"/>
+          <w:sz w:val="18"/>
+          <w:szCs w:val="18"/>
+          <w:u w:val="single"/>
+        </w:rPr>
+        <w:t>monitored_by</w:t>
+      </w:r>
+      <w:proofErr w:type="spellEnd"/>
+      <w:r>
+        <w:rPr>
+          <w:rFonts w:ascii="Cambria" w:eastAsia="Cambria" w:hAnsi="Cambria" w:cs="Cambria"/>
+          <w:sz w:val="18"/>
+          <w:szCs w:val="18"/>
+          <w:u w:val="single"/>
+        </w:rPr>
+        <w:t>}</w:t>
       </w:r>
     </w:p>
     <w:p>

</xml_diff>

<commit_message>
Undefined requested_by in borrow equiment form fix
</commit_message>
<xml_diff>
--- a/frontend/public/LDCU-Forms-CIT-033-Laboratoty Borrowing of Equipment.docx
+++ b/frontend/public/LDCU-Forms-CIT-033-Laboratoty Borrowing of Equipment.docx
@@ -426,6 +426,7 @@
           <w:p>
             <w:pPr>
               <w:spacing w:after="0" w:line="240" w:lineRule="auto"/>
+              <w:jc w:val="center"/>
               <w:rPr>
                 <w:rFonts w:ascii="Cambria" w:eastAsia="Cambria" w:hAnsi="Cambria" w:cs="Cambria"/>
                 <w:sz w:val="18"/>
@@ -467,6 +468,7 @@
           <w:p>
             <w:pPr>
               <w:spacing w:after="0" w:line="240" w:lineRule="auto"/>
+              <w:jc w:val="center"/>
               <w:rPr>
                 <w:rFonts w:ascii="Cambria" w:eastAsia="Cambria" w:hAnsi="Cambria" w:cs="Cambria"/>
                 <w:sz w:val="18"/>
@@ -590,6 +592,15 @@
           <w:szCs w:val="18"/>
           <w:u w:val="single"/>
         </w:rPr>
+        <w:t xml:space="preserve">  </w:t>
+      </w:r>
+      <w:r>
+        <w:rPr>
+          <w:rFonts w:ascii="Cambria" w:eastAsia="Cambria" w:hAnsi="Cambria" w:cs="Cambria"/>
+          <w:sz w:val="18"/>
+          <w:szCs w:val="18"/>
+          <w:u w:val="single"/>
+        </w:rPr>
         <w:t>{</w:t>
       </w:r>
       <w:proofErr w:type="spellStart"/>
@@ -635,6 +646,14 @@
           <w:szCs w:val="18"/>
         </w:rPr>
         <w:tab/>
+      </w:r>
+      <w:r>
+        <w:rPr>
+          <w:rFonts w:ascii="Cambria" w:eastAsia="Cambria" w:hAnsi="Cambria" w:cs="Cambria"/>
+          <w:sz w:val="18"/>
+          <w:szCs w:val="18"/>
+        </w:rPr>
+        <w:t xml:space="preserve">     </w:t>
       </w:r>
       <w:r>
         <w:rPr>
@@ -700,8 +719,6 @@
         <w:tab/>
         <w:t xml:space="preserve">                            Dean</w:t>
       </w:r>
-      <w:bookmarkStart w:id="0" w:name="_GoBack"/>
-      <w:bookmarkEnd w:id="0"/>
     </w:p>
     <w:p>
       <w:pPr>
@@ -835,7 +852,25 @@
           <w:szCs w:val="18"/>
         </w:rPr>
         <w:tab/>
-        <w:t xml:space="preserve">        </w:t>
+        <w:t xml:space="preserve">      </w:t>
+      </w:r>
+      <w:r>
+        <w:rPr>
+          <w:rFonts w:ascii="Cambria" w:eastAsia="Cambria" w:hAnsi="Cambria" w:cs="Cambria"/>
+          <w:sz w:val="18"/>
+          <w:szCs w:val="18"/>
+        </w:rPr>
+        <w:t xml:space="preserve">   </w:t>
+      </w:r>
+      <w:bookmarkStart w:id="0" w:name="_GoBack"/>
+      <w:bookmarkEnd w:id="0"/>
+      <w:r>
+        <w:rPr>
+          <w:rFonts w:ascii="Cambria" w:eastAsia="Cambria" w:hAnsi="Cambria" w:cs="Cambria"/>
+          <w:sz w:val="18"/>
+          <w:szCs w:val="18"/>
+        </w:rPr>
+        <w:t xml:space="preserve">  </w:t>
       </w:r>
       <w:r>
         <w:rPr>

</xml_diff>